<commit_message>
Amazing Grace lyrics: write out the final two-line repeat instead of (x2)
Co-Authored-By: Claude Opus 5 <noreply@anthropic.com>
</commit_message>
<xml_diff>
--- a/songs/Amazing Grace (Hymn) TCC Lyrics.docx
+++ b/songs/Amazing Grace (Hymn) TCC Lyrics.docx
@@ -400,7 +400,59 @@
           <w:i/>
           <w:iCs/>
         </w:rPr>
-        <w:t xml:space="preserve"> (x2)</w:t>
+        <w:t xml:space="preserve"/>
+      </w:r>
+    </w:p>
+    <w:p>
+      <w:pPr>
+        <w:rPr>
+          <w:rFonts w:ascii="Verdana" w:hAnsi="Verdana"/>
+          <w:i/>
+          <w:iCs/>
+        </w:rPr>
+      </w:pPr>
+      <w:r>
+        <w:rPr>
+          <w:rFonts w:ascii="Verdana" w:hAnsi="Verdana"/>
+          <w:i/>
+          <w:iCs/>
+        </w:rPr>
+        <w:t>We’ve no less days to sing God’s praise</w:t>
+      </w:r>
+    </w:p>
+    <w:p>
+      <w:pPr>
+        <w:rPr>
+          <w:rFonts w:ascii="Verdana" w:hAnsi="Verdana"/>
+          <w:i/>
+          <w:iCs/>
+        </w:rPr>
+      </w:pPr>
+      <w:proofErr w:type="gramStart"/>
+      <w:r>
+        <w:rPr>
+          <w:rFonts w:ascii="Verdana" w:hAnsi="Verdana"/>
+          <w:i/>
+          <w:iCs/>
+        </w:rPr>
+        <w:t>Than</w:t>
+      </w:r>
+      <w:proofErr w:type="gramEnd"/>
+      <w:r>
+        <w:rPr>
+          <w:rFonts w:ascii="Verdana" w:hAnsi="Verdana"/>
+          <w:i/>
+          <w:iCs/>
+        </w:rPr>
+        <w:t xml:space="preserve"> when we first begun.</w:t>
+      </w:r>
+      <w:r>
+        <w:rPr>
+          <w:rFonts w:ascii="Verdana" w:hAnsi="Verdana"/>
+          <w:i/>
+          <w:iCs/>
+        </w:rPr>
+        <w:t xml:space="preserve"/>
       </w:r>
     </w:p>
     <w:p/>

</xml_diff>

<commit_message>
Amazing Grace lyrics: make verse labels real section headers
Co-Authored-By: Claude Opus 5 <noreply@anthropic.com>
</commit_message>
<xml_diff>
--- a/songs/Amazing Grace (Hymn) TCC Lyrics.docx
+++ b/songs/Amazing Grace (Hymn) TCC Lyrics.docx
@@ -62,7 +62,7 @@
         <w:rPr>
           <w:rFonts w:ascii="Verdana" w:hAnsi="Verdana"/>
         </w:rPr>
-        <w:t>(Verse 1)</w:t>
+        <w:t>Verse 1</w:t>
       </w:r>
     </w:p>
     <w:p>
@@ -134,7 +134,7 @@
         <w:rPr>
           <w:rFonts w:ascii="Verdana" w:hAnsi="Verdana"/>
         </w:rPr>
-        <w:t xml:space="preserve">(Verse </w:t>
+        <w:t xml:space="preserve">Verse </w:t>
       </w:r>
       <w:r>
         <w:rPr>
@@ -146,7 +146,7 @@
         <w:rPr>
           <w:rFonts w:ascii="Verdana" w:hAnsi="Verdana"/>
         </w:rPr>
-        <w:t>)</w:t>
+        <w:t/>
       </w:r>
     </w:p>
     <w:p>
@@ -226,7 +226,7 @@
         <w:rPr>
           <w:rFonts w:ascii="Verdana" w:hAnsi="Verdana"/>
         </w:rPr>
-        <w:t xml:space="preserve">(Verse </w:t>
+        <w:t xml:space="preserve">Verse </w:t>
       </w:r>
       <w:r>
         <w:rPr>
@@ -238,7 +238,7 @@
         <w:rPr>
           <w:rFonts w:ascii="Verdana" w:hAnsi="Verdana"/>
         </w:rPr>
-        <w:t>)</w:t>
+        <w:t/>
       </w:r>
     </w:p>
     <w:p>
@@ -310,7 +310,7 @@
         <w:rPr>
           <w:rFonts w:ascii="Verdana" w:hAnsi="Verdana"/>
         </w:rPr>
-        <w:t xml:space="preserve">(Verse </w:t>
+        <w:t xml:space="preserve">Verse </w:t>
       </w:r>
       <w:r>
         <w:rPr>
@@ -322,7 +322,7 @@
         <w:rPr>
           <w:rFonts w:ascii="Verdana" w:hAnsi="Verdana"/>
         </w:rPr>
-        <w:t>)</w:t>
+        <w:t/>
       </w:r>
     </w:p>
     <w:p>

</xml_diff>